<commit_message>
Add structured table for commodity specifications in document generator
Replaced the commodity specifications textarea with a dynamic table component in the LOI form, including add/remove row functionality and serialization to the existing qualitySpecs field.

Replit-Commit-Author: Agent
Replit-Commit-Session-Id: 359075c4-f6cc-4727-990b-acbaafad0c22
Replit-Commit-Checkpoint-Type: full_checkpoint
Replit-Commit-Event-Id: f28bc6cb-a952-4f78-9d71-4d6a8e286ef4
Replit-Commit-Screenshot-Url: https://storage.googleapis.com/screenshot-production-us-central1/efc895ca-161b-43cb-8555-2a7825ee93b6/359075c4-f6cc-4727-990b-acbaafad0c22/0GLzkxK
Replit-Helium-Checkpoint-Created: true
</commit_message>
<xml_diff>
--- a/generated_docs/853eecf0-aeba-4908-95ec-a18cfa6cccdb.docx
+++ b/generated_docs/853eecf0-aeba-4908-95ec-a18cfa6cccdb.docx
@@ -1687,45 +1687,7 @@
     </w:p>
     <w:p>
       <w:pPr>
-        <w:spacing w:after="80"/>
-      </w:pPr>
-      <w:r>
-        <w:rPr>
-          <w:rFonts w:ascii="Calibri" w:cs="Calibri" w:eastAsia="Calibri" w:hAnsi="Calibri"/>
-          <w:i w:val="false"/>
-          <w:iCs w:val="false"/>
-          <w:sz w:val="18"/>
-          <w:szCs w:val="18"/>
-        </w:rPr>
-        <w:t xml:space="preserve">For &amp; On Behalf of</w:t>
-      </w:r>
-    </w:p>
-    <w:p>
-      <w:pPr>
-        <w:spacing w:before="400"/>
-      </w:pPr>
-    </w:p>
-    <w:p>
-      <w:pPr>
-        <w:pBdr>
-          <w:bottom w:val="single" w:color="999999" w:sz="1"/>
-        </w:pBdr>
-        <w:spacing w:after="100"/>
-      </w:pPr>
-      <w:r>
-        <w:rPr>
-          <w:rFonts w:ascii="Calibri" w:cs="Calibri" w:eastAsia="Calibri" w:hAnsi="Calibri"/>
-          <w:b/>
-          <w:bCs/>
-          <w:sz w:val="20"/>
-          <w:szCs w:val="20"/>
-        </w:rPr>
-        <w:t xml:space="preserve">AUTHORIZED SIGNATORY</w:t>
-      </w:r>
-    </w:p>
-    <w:p>
-      <w:pPr>
-        <w:spacing w:before="200"/>
+        <w:spacing w:before="100"/>
       </w:pPr>
     </w:p>
     <w:p>
@@ -1739,72 +1701,73 @@
           <w:sz w:val="16"/>
           <w:szCs w:val="16"/>
         </w:rPr>
-        <w:t xml:space="preserve">For &amp; On Behalf of:</w:t>
+        <w:t xml:space="preserve">Digital Signature:</w:t>
       </w:r>
     </w:p>
     <w:p>
       <w:pPr>
-        <w:spacing w:after="200"/>
+        <w:pBdr>
+          <w:top w:val="single" w:color="CCCCCC" w:sz="1"/>
+          <w:bottom w:val="single" w:color="CCCCCC" w:sz="1"/>
+          <w:left w:val="single" w:color="CCCCCC" w:sz="1"/>
+          <w:right w:val="single" w:color="CCCCCC" w:sz="1"/>
+        </w:pBdr>
+        <w:spacing w:after="40" w:before="40"/>
+      </w:pPr>
+      <w:r>
+        <w:rPr>
+          <w:sz w:val="18"/>
+          <w:szCs w:val="18"/>
+        </w:rPr>
+        <w:t xml:space="preserve"> </w:t>
+      </w:r>
+    </w:p>
+    <w:p>
+      <w:pPr>
+        <w:pBdr>
+          <w:top w:val="none" w:color="FFFFFF" w:sz="0"/>
+          <w:bottom w:val="single" w:color="CCCCCC" w:sz="1"/>
+          <w:left w:val="single" w:color="CCCCCC" w:sz="1"/>
+          <w:right w:val="single" w:color="CCCCCC" w:sz="1"/>
+        </w:pBdr>
+        <w:spacing w:after="0" w:before="0"/>
+      </w:pPr>
+      <w:r>
+        <w:rPr>
+          <w:sz w:val="18"/>
+          <w:szCs w:val="18"/>
+        </w:rPr>
+        <w:t xml:space="preserve"> </w:t>
+      </w:r>
+    </w:p>
+    <w:p>
+      <w:pPr>
+        <w:pBdr>
+          <w:top w:val="none" w:color="FFFFFF" w:sz="0"/>
+          <w:bottom w:val="single" w:color="CCCCCC" w:sz="1"/>
+          <w:left w:val="single" w:color="CCCCCC" w:sz="1"/>
+          <w:right w:val="single" w:color="CCCCCC" w:sz="1"/>
+        </w:pBdr>
+        <w:spacing w:after="40" w:before="0"/>
+      </w:pPr>
+      <w:r>
+        <w:rPr>
+          <w:sz w:val="18"/>
+          <w:szCs w:val="18"/>
+        </w:rPr>
+        <w:t xml:space="preserve"> </w:t>
+      </w:r>
+    </w:p>
+    <w:p>
+      <w:pPr>
+        <w:spacing w:after="200" w:before="80"/>
       </w:pPr>
       <w:r>
         <w:rPr>
           <w:rFonts w:ascii="Calibri" w:cs="Calibri" w:eastAsia="Calibri" w:hAnsi="Calibri"/>
-          <w:b/>
-          <w:bCs/>
-          <w:sz w:val="22"/>
-          <w:szCs w:val="22"/>
-        </w:rPr>
-        <w:t xml:space="preserve">AL FAKHAMA</w:t>
-      </w:r>
-    </w:p>
-    <w:p>
-      <w:pPr>
-        <w:spacing w:after="100"/>
-      </w:pPr>
-      <w:r>
-        <w:rPr>
-          <w:rFonts w:ascii="Calibri" w:cs="Calibri" w:eastAsia="Calibri" w:hAnsi="Calibri"/>
-          <w:sz w:val="18"/>
-          <w:szCs w:val="18"/>
-        </w:rPr>
-        <w:t xml:space="preserve">Signature: ___________________________</w:t>
-      </w:r>
-    </w:p>
-    <w:p>
-      <w:pPr>
-        <w:spacing w:after="100"/>
-      </w:pPr>
-      <w:r>
-        <w:rPr>
-          <w:rFonts w:ascii="Calibri" w:cs="Calibri" w:eastAsia="Calibri" w:hAnsi="Calibri"/>
-          <w:sz w:val="18"/>
-          <w:szCs w:val="18"/>
-        </w:rPr>
-        <w:t xml:space="preserve">Name: ___________________________</w:t>
-      </w:r>
-    </w:p>
-    <w:p>
-      <w:pPr>
-        <w:spacing w:after="100"/>
-      </w:pPr>
-      <w:r>
-        <w:rPr>
-          <w:rFonts w:ascii="Calibri" w:cs="Calibri" w:eastAsia="Calibri" w:hAnsi="Calibri"/>
-          <w:sz w:val="18"/>
-          <w:szCs w:val="18"/>
-        </w:rPr>
-        <w:t xml:space="preserve">Title: ___________________________</w:t>
-      </w:r>
-    </w:p>
-    <w:p>
-      <w:pPr>
-        <w:spacing w:after="200"/>
-      </w:pPr>
-      <w:r>
-        <w:rPr>
-          <w:rFonts w:ascii="Calibri" w:cs="Calibri" w:eastAsia="Calibri" w:hAnsi="Calibri"/>
-          <w:sz w:val="18"/>
-          <w:szCs w:val="18"/>
+          <w:color w:val="555555"/>
+          <w:sz w:val="16"/>
+          <w:szCs w:val="16"/>
         </w:rPr>
         <w:t xml:space="preserve">Date: 10 March 2026</w:t>
       </w:r>

</xml_diff>